<commit_message>
sync: apply browser edits to IMS (POL-02-Data-Protection-Privacy-Policy.docx)
</commit_message>
<xml_diff>
--- a/public/ims/POL-02-Data-Protection-Privacy-Policy.docx
+++ b/public/ims/POL-02-Data-Protection-Privacy-Policy.docx
@@ -99,7 +99,7 @@
                 <w:sz w:val="28"/>
                 <w:szCs w:val="28"/>
               </w:rPr>
-              <w:t xml:space="preserve">Data Protection &amp; Privacy Policy</w:t>
+              <w:t xml:space="preserve">Data pipeline test — Policy</w:t>
             </w:r>
           </w:p>
         </w:tc>
@@ -385,7 +385,7 @@
                 <w:sz w:val="20"/>
                 <w:szCs w:val="20"/>
               </w:rPr>
-              <w:t xml:space="preserve">Dr. Stefan Gravesande</w:t>
+              <w:t xml:space="preserve">Dr. browser-saved Gravesande</w:t>
             </w:r>
           </w:p>
         </w:tc>
@@ -517,7 +517,7 @@
                 <w:sz w:val="20"/>
                 <w:szCs w:val="20"/>
               </w:rPr>
-              <w:t xml:space="preserve">ISO 9001:2015 §7.5; TT Data Protection Act 2011</w:t>
+              <w:t xml:space="preserve">ISO 9001:2015 §7.5; TT Data pipeline Act 2011</w:t>
             </w:r>
           </w:p>
         </w:tc>
@@ -700,7 +700,7 @@
           <w:sz w:val="24"/>
           <w:szCs w:val="24"/>
         </w:rPr>
-        <w:t xml:space="preserve">Data Storage &amp; Security</w:t>
+        <w:t xml:space="preserve">Data Storage test Security</w:t>
       </w:r>
     </w:p>
     <w:p>
@@ -866,7 +866,7 @@
           <w:sz w:val="22"/>
           <w:szCs w:val="22"/>
         </w:rPr>
-        <w:t xml:space="preserve">Signed: _________________  |  Name: Dr. Stefan Gravesande  |  Date: 2026-05-08</w:t>
+        <w:t xml:space="preserve">Signed: _________________  |  Name: Dr. browser-saved Gravesande  |  Date: 2026-05-08</w:t>
       </w:r>
     </w:p>
     <w:sectPr>

</xml_diff>